<commit_message>
Add SQL Server monitoring and availability experience
</commit_message>
<xml_diff>
--- a/Output/Pedro_Gutierrez_Senior_Microsoft_SQL_Server_DBA_CV.docx
+++ b/Output/Pedro_Gutierrez_Senior_Microsoft_SQL_Server_DBA_CV.docx
@@ -256,7 +256,7 @@
               <w:rPr>
                 <w:sz w:val="17"/>
               </w:rPr>
-              <w:t>Advanced T-SQL, complex queries, stored procedures, indexing strategies, query optimization, performance tuning, troubleshooting</w:t>
+              <w:t>Advanced T-SQL, complex queries, stored procedures, indexing strategies, query optimization, execution analysis, Extended Events, Query Store</w:t>
             </w:r>
           </w:p>
         </w:tc>
@@ -813,6 +813,15 @@
         <w:spacing w:after="30" w:line="245" w:lineRule="auto"/>
       </w:pPr>
       <w:r>
+        <w:t>Supported SQL Server Always On configurations and used Extended Events to investigate workload behavior and performance issues.</w:t>
+      </w:r>
+    </w:p>
+    <w:p>
+      <w:pPr>
+        <w:pStyle w:val="ListBullet"/>
+        <w:spacing w:after="30" w:line="245" w:lineRule="auto"/>
+      </w:pPr>
+      <w:r>
         <w:t>Delivered end-to-end database and data integration solutions aligned with business and infrastructure requirements.</w:t>
       </w:r>
     </w:p>
@@ -834,7 +843,7 @@
           <w:i w:val="0"/>
           <w:sz w:val="18"/>
         </w:rPr>
-        <w:t>SQL Server, SSIS, SSRS, PostgreSQL, Power BI, Excel</w:t>
+        <w:t>SQL Server, Always On, Extended Events, SSIS, SSRS, PostgreSQL, Power BI, Excel</w:t>
       </w:r>
     </w:p>
     <w:p>
@@ -882,6 +891,15 @@
         <w:spacing w:after="30" w:line="245" w:lineRule="auto"/>
       </w:pPr>
       <w:r>
+        <w:t>Supported SQL Server Always On environments and used Extended Events and Query Store to analyze workloads and troubleshoot query performance.</w:t>
+      </w:r>
+    </w:p>
+    <w:p>
+      <w:pPr>
+        <w:pStyle w:val="ListBullet"/>
+        <w:spacing w:after="30" w:line="245" w:lineRule="auto"/>
+      </w:pPr>
+      <w:r>
         <w:t>Supported large datasets and reporting needs by improving structures used for analysis and business decision-making.</w:t>
       </w:r>
     </w:p>
@@ -903,7 +921,7 @@
           <w:i w:val="0"/>
           <w:sz w:val="18"/>
         </w:rPr>
-        <w:t>SQL Server, SSIS, SSAS, SSRS, Power BI, Azure</w:t>
+        <w:t>SQL Server, Always On, Extended Events, Query Store, SSIS, SSAS, SSRS, Power BI, Azure</w:t>
       </w:r>
     </w:p>
     <w:p>

</xml_diff>